<commit_message>
java assignment 2 completed
</commit_message>
<xml_diff>
--- a/Core java/java.docx
+++ b/Core java/java.docx
@@ -19,15 +19,7 @@
     </w:p>
     <w:p>
       <w:r>
-        <w:t xml:space="preserve"> but like c lang which generates .</w:t>
-      </w:r>
-      <w:proofErr w:type="spellStart"/>
-      <w:r>
-        <w:t>obj</w:t>
-      </w:r>
-      <w:proofErr w:type="spellEnd"/>
-      <w:r>
-        <w:t xml:space="preserve"> file which is machine code</w:t>
+        <w:t xml:space="preserve"> but like c lang which generates .obj file which is machine code</w:t>
       </w:r>
     </w:p>
     <w:p/>
@@ -37,43 +29,23 @@
       </w:r>
     </w:p>
     <w:p>
-      <w:proofErr w:type="spellStart"/>
-      <w:r>
-        <w:t>jdk</w:t>
-      </w:r>
-      <w:proofErr w:type="spellEnd"/>
-      <w:r>
-        <w:t xml:space="preserve"> =&gt; java development kit</w:t>
-      </w:r>
-    </w:p>
-    <w:p>
-      <w:proofErr w:type="spellStart"/>
-      <w:r>
-        <w:t>jvm</w:t>
-      </w:r>
-      <w:proofErr w:type="spellEnd"/>
-      <w:r>
-        <w:t xml:space="preserve"> =&gt; java virtual machine</w:t>
-      </w:r>
-    </w:p>
-    <w:p>
-      <w:proofErr w:type="spellStart"/>
-      <w:r>
-        <w:t>jit</w:t>
-      </w:r>
-      <w:proofErr w:type="spellEnd"/>
-      <w:r>
-        <w:t xml:space="preserve"> =&gt; just in time compiler</w:t>
-      </w:r>
-    </w:p>
-    <w:p>
-      <w:proofErr w:type="spellStart"/>
-      <w:r>
-        <w:t>jre</w:t>
-      </w:r>
-      <w:proofErr w:type="spellEnd"/>
-      <w:r>
-        <w:t xml:space="preserve"> =&gt; java runtime environment</w:t>
+      <w:r>
+        <w:t>jdk =&gt; java development kit</w:t>
+      </w:r>
+    </w:p>
+    <w:p>
+      <w:r>
+        <w:t>jvm =&gt; java virtual machine</w:t>
+      </w:r>
+    </w:p>
+    <w:p>
+      <w:r>
+        <w:t>jit =&gt; just in time compiler</w:t>
+      </w:r>
+    </w:p>
+    <w:p>
+      <w:r>
+        <w:t>jre =&gt; java runtime environment</w:t>
       </w:r>
     </w:p>
     <w:p>
@@ -173,15 +145,7 @@
         <w:t xml:space="preserve">** </w:t>
       </w:r>
       <w:r>
-        <w:t xml:space="preserve">in java static method can be </w:t>
-      </w:r>
-      <w:proofErr w:type="spellStart"/>
-      <w:r>
-        <w:t>runned</w:t>
-      </w:r>
-      <w:proofErr w:type="spellEnd"/>
-      <w:r>
-        <w:t xml:space="preserve"> without any object declaration</w:t>
+        <w:t>in java static method can be runned without any object declaration</w:t>
       </w:r>
       <w:r>
         <w:t xml:space="preserve"> **</w:t>
@@ -190,55 +154,18 @@
     <w:p/>
     <w:p>
       <w:r>
-        <w:t xml:space="preserve">String is a predefined class from </w:t>
-      </w:r>
-      <w:proofErr w:type="spellStart"/>
-      <w:r>
-        <w:t>java.lang</w:t>
-      </w:r>
-      <w:proofErr w:type="spellEnd"/>
-      <w:r>
-        <w:t xml:space="preserve"> package and </w:t>
-      </w:r>
-      <w:proofErr w:type="spellStart"/>
-      <w:r>
-        <w:t>java.lang</w:t>
-      </w:r>
-      <w:proofErr w:type="spellEnd"/>
-      <w:r>
-        <w:t xml:space="preserve"> is a default package which is not imported</w:t>
-      </w:r>
-    </w:p>
-    <w:p>
-      <w:r>
-        <w:t xml:space="preserve">In java main class </w:t>
-      </w:r>
-      <w:proofErr w:type="spellStart"/>
-      <w:r>
-        <w:t>args</w:t>
-      </w:r>
-      <w:proofErr w:type="spellEnd"/>
-      <w:r>
-        <w:t xml:space="preserve">[] is just a name which can be used as any name and </w:t>
-      </w:r>
-      <w:proofErr w:type="spellStart"/>
-      <w:r>
-        <w:t>args</w:t>
-      </w:r>
-      <w:proofErr w:type="spellEnd"/>
-      <w:r>
-        <w:t>[] is used to store collection of objects</w:t>
+        <w:t>String is a predefined class from java.lang package and java.lang is a default package which is not imported</w:t>
+      </w:r>
+    </w:p>
+    <w:p>
+      <w:r>
+        <w:t>In java main class args[] is just a name which can be used as any name and args[] is used to store collection of objects</w:t>
       </w:r>
     </w:p>
     <w:p/>
     <w:p>
-      <w:proofErr w:type="spellStart"/>
-      <w:r>
-        <w:t>System.out.println</w:t>
-      </w:r>
-      <w:proofErr w:type="spellEnd"/>
-      <w:r>
-        <w:t>(“”);</w:t>
+      <w:r>
+        <w:t>System.out.println(“”);</w:t>
       </w:r>
     </w:p>
     <w:p>
@@ -316,19 +243,14 @@
     </w:p>
     <w:p>
       <w:r>
-        <w:t xml:space="preserve">New is a keyword which is used to allocate memory to </w:t>
-      </w:r>
-      <w:proofErr w:type="spellStart"/>
-      <w:r>
-        <w:t>a</w:t>
-      </w:r>
-      <w:proofErr w:type="spellEnd"/>
-      <w:r>
-        <w:t xml:space="preserve"> object in runtime</w:t>
-      </w:r>
-    </w:p>
-    <w:p>
-      <w:r>
+        <w:t>New is a keyword which is used to allocate memory to a object in runtime</w:t>
+      </w:r>
+    </w:p>
+    <w:p>
+      <w:r>
+        <w:rPr>
+          <w:noProof/>
+        </w:rPr>
         <w:lastRenderedPageBreak/>
         <w:drawing>
           <wp:inline distT="0" distB="0" distL="0" distR="0" wp14:anchorId="2DA5C6FC" wp14:editId="589D12F7">
@@ -588,6 +510,13 @@
         <w:tabs>
           <w:tab w:val="left" w:pos="2235"/>
         </w:tabs>
+        <w:rPr>
+          <w:rFonts w:ascii="Roboto" w:hAnsi="Roboto"/>
+          <w:color w:val="202124"/>
+          <w:sz w:val="20"/>
+          <w:szCs w:val="20"/>
+          <w:shd w:val="clear" w:color="auto" w:fill="FFFFFF"/>
+        </w:rPr>
       </w:pPr>
       <w:r>
         <w:rPr>
@@ -598,6 +527,44 @@
           <w:shd w:val="clear" w:color="auto" w:fill="FFFFFF"/>
         </w:rPr>
         <w:t>10) How to Print ASCII Value in Java</w:t>
+      </w:r>
+    </w:p>
+    <w:p/>
+    <w:p>
+      <w:pPr>
+        <w:rPr>
+          <w:rFonts w:ascii="Roboto" w:hAnsi="Roboto"/>
+          <w:color w:val="202124"/>
+          <w:sz w:val="20"/>
+          <w:szCs w:val="20"/>
+          <w:shd w:val="clear" w:color="auto" w:fill="FFFFFF"/>
+        </w:rPr>
+      </w:pPr>
+    </w:p>
+    <w:p>
+      <w:r>
+        <w:t xml:space="preserve">This keyword in java </w:t>
+      </w:r>
+    </w:p>
+    <w:p>
+      <w:r>
+        <w:t>‘this’ is a keyword which describes the current class object</w:t>
+      </w:r>
+    </w:p>
+    <w:p/>
+    <w:p>
+      <w:r>
+        <w:t xml:space="preserve">Method overloading in java </w:t>
+      </w:r>
+    </w:p>
+    <w:p>
+      <w:r>
+        <w:t>A overloaded method can be identified by compiler during the compiletime itself</w:t>
+      </w:r>
+    </w:p>
+    <w:p>
+      <w:r>
+        <w:t>By checking the arguments list and type</w:t>
       </w:r>
     </w:p>
     <w:sectPr>

</xml_diff>